<commit_message>
docs: translate screenshot documentation to Arabic
</commit_message>
<xml_diff>
--- a/SCREENSHOTS.docx
+++ b/SCREENSHOTS.docx
@@ -5,408 +5,87 @@
     <w:p>
       <w:pPr>
         <w:pStyle w:val="Title"/>
+        <w:jc w:val="center"/>
+        <w:bidi w:val="1"/>
       </w:pPr>
       <w:r>
-        <w:t>SmartClinic - Required Evidence Screenshots</w:t>
+        <w:t>SmartClinic</w:t>
+      </w:r>
+    </w:p>
+    <w:p>
+      <w:pPr>
+        <w:jc w:val="center"/>
+        <w:bidi w:val="1"/>
+      </w:pPr>
+      <w:r>
+        <w:rPr>
+          <w:b/>
+        </w:rPr>
+        <w:t>توثيق لقطات الشاشة والأدلة</w:t>
+      </w:r>
+    </w:p>
+    <w:p>
+      <w:pPr>
+        <w:jc w:val="right"/>
+        <w:bidi w:val="1"/>
+      </w:pPr>
+      <w:r>
+        <w:t>يهدف هذا المستند إلى توثيق لقطات الشاشة الفعلية التي تثبت مراحل مراجعة مشروع SmartClinic واختباره وتجهيزه للتسليم. تم استخدام الصور الأصلية الموجودة في مجلد screenshots فقط، دون إنشاء أو تعديل أي دليل مصوّر.</w:t>
       </w:r>
     </w:p>
     <w:p>
       <w:r>
-        <w:t>Project: SmartClinic</w:t>
+        <w:br w:type="page"/>
       </w:r>
     </w:p>
     <w:p>
+      <w:pPr>
+        <w:pStyle w:val="Heading1"/>
+        <w:jc w:val="right"/>
+        <w:bidi w:val="1"/>
+      </w:pPr>
       <w:r>
-        <w:t>Purpose: catalog the ten real terminal screenshots used as course evidence for Git, testing, commits, and repository verification.</w:t>
+        <w:t>الصورة 1</w:t>
       </w:r>
     </w:p>
     <w:p>
-      <w:r>
-        <w:t>Only existing images from D:\SmartClinic\screenshots are embedded. No evidence is generated or reconstructed.</w:t>
-      </w:r>
-    </w:p>
-    <w:tbl>
-      <w:tblPr>
-        <w:tblStyle w:val="TableGrid"/>
-        <w:tblW w:type="auto" w:w="0"/>
-        <w:tblLook w:firstColumn="1" w:firstRow="1" w:lastColumn="0" w:lastRow="0" w:noHBand="0" w:noVBand="1" w:val="04A0"/>
-      </w:tblPr>
-      <w:tblGrid>
-        <w:gridCol w:w="2880"/>
-        <w:gridCol w:w="2880"/>
-        <w:gridCol w:w="2880"/>
-      </w:tblGrid>
-      <w:tr>
-        <w:tc>
-          <w:tcPr>
-            <w:tcW w:type="dxa" w:w="2880"/>
-          </w:tcPr>
-          <w:p>
-            <w:r>
-              <w:t>No.</w:t>
-            </w:r>
-          </w:p>
-        </w:tc>
-        <w:tc>
-          <w:tcPr>
-            <w:tcW w:type="dxa" w:w="2880"/>
-          </w:tcPr>
-          <w:p>
-            <w:r>
-              <w:t>Exact filename</w:t>
-            </w:r>
-          </w:p>
-        </w:tc>
-        <w:tc>
-          <w:tcPr>
-            <w:tcW w:type="dxa" w:w="2880"/>
-          </w:tcPr>
-          <w:p>
-            <w:r>
-              <w:t>What it proves</w:t>
-            </w:r>
-          </w:p>
-        </w:tc>
-      </w:tr>
-      <w:tr>
-        <w:tc>
-          <w:tcPr>
-            <w:tcW w:type="dxa" w:w="2880"/>
-          </w:tcPr>
-          <w:p>
-            <w:r>
-              <w:t>1</w:t>
-            </w:r>
-          </w:p>
-        </w:tc>
-        <w:tc>
-          <w:tcPr>
-            <w:tcW w:type="dxa" w:w="2880"/>
-          </w:tcPr>
-          <w:p>
-            <w:r>
-              <w:t>14_01_git_status_staged.png</w:t>
-            </w:r>
-          </w:p>
-        </w:tc>
-        <w:tc>
-          <w:tcPr>
-            <w:tcW w:type="dxa" w:w="2880"/>
-          </w:tcPr>
-          <w:p>
-            <w:r>
-              <w:t>Shows the staged project files in Git status.</w:t>
-            </w:r>
-          </w:p>
-        </w:tc>
-      </w:tr>
-      <w:tr>
-        <w:tc>
-          <w:tcPr>
-            <w:tcW w:type="dxa" w:w="2880"/>
-          </w:tcPr>
-          <w:p>
-            <w:r>
-              <w:t>2</w:t>
-            </w:r>
-          </w:p>
-        </w:tc>
-        <w:tc>
-          <w:tcPr>
-            <w:tcW w:type="dxa" w:w="2880"/>
-          </w:tcPr>
-          <w:p>
-            <w:r>
-              <w:t>14_03_git_diff_staged_stat_terminal.png</w:t>
-            </w:r>
-          </w:p>
-        </w:tc>
-        <w:tc>
-          <w:tcPr>
-            <w:tcW w:type="dxa" w:w="2880"/>
-          </w:tcPr>
-          <w:p>
-            <w:r>
-              <w:t>Shows the staged diff summary and file counts.</w:t>
-            </w:r>
-          </w:p>
-        </w:tc>
-      </w:tr>
-      <w:tr>
-        <w:tc>
-          <w:tcPr>
-            <w:tcW w:type="dxa" w:w="2880"/>
-          </w:tcPr>
-          <w:p>
-            <w:r>
-              <w:t>3</w:t>
-            </w:r>
-          </w:p>
-        </w:tc>
-        <w:tc>
-          <w:tcPr>
-            <w:tcW w:type="dxa" w:w="2880"/>
-          </w:tcPr>
-          <w:p>
-            <w:r>
-              <w:t>14_04_git_diff_staged_check_terminal.png</w:t>
-            </w:r>
-          </w:p>
-        </w:tc>
-        <w:tc>
-          <w:tcPr>
-            <w:tcW w:type="dxa" w:w="2880"/>
-          </w:tcPr>
-          <w:p>
-            <w:r>
-              <w:t>Shows staged whitespace validation completing without errors.</w:t>
-            </w:r>
-          </w:p>
-        </w:tc>
-      </w:tr>
-      <w:tr>
-        <w:tc>
-          <w:tcPr>
-            <w:tcW w:type="dxa" w:w="2880"/>
-          </w:tcPr>
-          <w:p>
-            <w:r>
-              <w:t>4</w:t>
-            </w:r>
-          </w:p>
-        </w:tc>
-        <w:tc>
-          <w:tcPr>
-            <w:tcW w:type="dxa" w:w="2880"/>
-          </w:tcPr>
-          <w:p>
-            <w:r>
-              <w:t>14_05_pytest_full_suite_terminal.png</w:t>
-            </w:r>
-          </w:p>
-        </w:tc>
-        <w:tc>
-          <w:tcPr>
-            <w:tcW w:type="dxa" w:w="2880"/>
-          </w:tcPr>
-          <w:p>
-            <w:r>
-              <w:t>Shows the complete pytest suite result.</w:t>
-            </w:r>
-          </w:p>
-        </w:tc>
-      </w:tr>
-      <w:tr>
-        <w:tc>
-          <w:tcPr>
-            <w:tcW w:type="dxa" w:w="2880"/>
-          </w:tcPr>
-          <w:p>
-            <w:r>
-              <w:t>5</w:t>
-            </w:r>
-          </w:p>
-        </w:tc>
-        <w:tc>
-          <w:tcPr>
-            <w:tcW w:type="dxa" w:w="2880"/>
-          </w:tcPr>
-          <w:p>
-            <w:r>
-              <w:t>14_06_git_diff_staged_terminal.png</w:t>
-            </w:r>
-          </w:p>
-        </w:tc>
-        <w:tc>
-          <w:tcPr>
-            <w:tcW w:type="dxa" w:w="2880"/>
-          </w:tcPr>
-          <w:p>
-            <w:r>
-              <w:t>Shows the complete staged diff review.</w:t>
-            </w:r>
-          </w:p>
-        </w:tc>
-      </w:tr>
-      <w:tr>
-        <w:tc>
-          <w:tcPr>
-            <w:tcW w:type="dxa" w:w="2880"/>
-          </w:tcPr>
-          <w:p>
-            <w:r>
-              <w:t>6</w:t>
-            </w:r>
-          </w:p>
-        </w:tc>
-        <w:tc>
-          <w:tcPr>
-            <w:tcW w:type="dxa" w:w="2880"/>
-          </w:tcPr>
-          <w:p>
-            <w:r>
-              <w:t>14_06_initial_commit_terminal.png</w:t>
-            </w:r>
-          </w:p>
-        </w:tc>
-        <w:tc>
-          <w:tcPr>
-            <w:tcW w:type="dxa" w:w="2880"/>
-          </w:tcPr>
-          <w:p>
-            <w:r>
-              <w:t>Shows creation of the initial SmartClinic baseline commit.</w:t>
-            </w:r>
-          </w:p>
-        </w:tc>
-      </w:tr>
-      <w:tr>
-        <w:tc>
-          <w:tcPr>
-            <w:tcW w:type="dxa" w:w="2880"/>
-          </w:tcPr>
-          <w:p>
-            <w:r>
-              <w:t>7</w:t>
-            </w:r>
-          </w:p>
-        </w:tc>
-        <w:tc>
-          <w:tcPr>
-            <w:tcW w:type="dxa" w:w="2880"/>
-          </w:tcPr>
-          <w:p>
-            <w:r>
-              <w:t>14_07_git_log_initial_commit_terminal.png</w:t>
-            </w:r>
-          </w:p>
-        </w:tc>
-        <w:tc>
-          <w:tcPr>
-            <w:tcW w:type="dxa" w:w="2880"/>
-          </w:tcPr>
-          <w:p>
-            <w:r>
-              <w:t>Shows the initial commit in Git history.</w:t>
-            </w:r>
-          </w:p>
-        </w:tc>
-      </w:tr>
-      <w:tr>
-        <w:tc>
-          <w:tcPr>
-            <w:tcW w:type="dxa" w:w="2880"/>
-          </w:tcPr>
-          <w:p>
-            <w:r>
-              <w:t>8</w:t>
-            </w:r>
-          </w:p>
-        </w:tc>
-        <w:tc>
-          <w:tcPr>
-            <w:tcW w:type="dxa" w:w="2880"/>
-          </w:tcPr>
-          <w:p>
-            <w:r>
-              <w:t>14_08_git_status_clean_terminal.png</w:t>
-            </w:r>
-          </w:p>
-        </w:tc>
-        <w:tc>
-          <w:tcPr>
-            <w:tcW w:type="dxa" w:w="2880"/>
-          </w:tcPr>
-          <w:p>
-            <w:r>
-              <w:t>Shows a clean working tree after the initial commit.</w:t>
-            </w:r>
-          </w:p>
-        </w:tc>
-      </w:tr>
-      <w:tr>
-        <w:tc>
-          <w:tcPr>
-            <w:tcW w:type="dxa" w:w="2880"/>
-          </w:tcPr>
-          <w:p>
-            <w:r>
-              <w:t>9</w:t>
-            </w:r>
-          </w:p>
-        </w:tc>
-        <w:tc>
-          <w:tcPr>
-            <w:tcW w:type="dxa" w:w="2880"/>
-          </w:tcPr>
-          <w:p>
-            <w:r>
-              <w:t>14_09_git_log_terminal.png</w:t>
-            </w:r>
-          </w:p>
-        </w:tc>
-        <w:tc>
-          <w:tcPr>
-            <w:tcW w:type="dxa" w:w="2880"/>
-          </w:tcPr>
-          <w:p>
-            <w:r>
-              <w:t>Shows Git log verification for the project history.</w:t>
-            </w:r>
-          </w:p>
-        </w:tc>
-      </w:tr>
-      <w:tr>
-        <w:tc>
-          <w:tcPr>
-            <w:tcW w:type="dxa" w:w="2880"/>
-          </w:tcPr>
-          <w:p>
-            <w:r>
-              <w:t>10</w:t>
-            </w:r>
-          </w:p>
-        </w:tc>
-        <w:tc>
-          <w:tcPr>
-            <w:tcW w:type="dxa" w:w="2880"/>
-          </w:tcPr>
-          <w:p>
-            <w:r>
-              <w:t>15_04_git_status_clean_terminal.png</w:t>
-            </w:r>
-          </w:p>
-        </w:tc>
-        <w:tc>
-          <w:tcPr>
-            <w:tcW w:type="dxa" w:w="2880"/>
-          </w:tcPr>
-          <w:p>
-            <w:r>
-              <w:t>Shows the clean working tree after screenshot publication.</w:t>
-            </w:r>
-          </w:p>
-        </w:tc>
-      </w:tr>
-    </w:tbl>
-    <w:p>
       <w:pPr>
-        <w:pStyle w:val="Heading2"/>
+        <w:jc w:val="right"/>
+        <w:bidi w:val="1"/>
       </w:pPr>
       <w:r>
-        <w:t>1. 14_01_git_status_staged.png</w:t>
+        <w:rPr>
+          <w:b/>
+        </w:rPr>
+        <w:t xml:space="preserve">اسم الملف: </w:t>
+      </w:r>
+      <w:r>
+        <w:t>14_01_git_status_staged.png</w:t>
       </w:r>
     </w:p>
     <w:p>
+      <w:pPr>
+        <w:jc w:val="right"/>
+        <w:bidi w:val="1"/>
+      </w:pPr>
       <w:r>
-        <w:t>Shows the staged project files in Git status.</w:t>
+        <w:rPr>
+          <w:b/>
+        </w:rPr>
+        <w:t xml:space="preserve">الشرح: </w:t>
+      </w:r>
+      <w:r>
+        <w:t>توضح هذه الصورة حالة مستودع Git بعد إضافة الملفات إلى منطقة التجهيز (Staging Area)، وتستخدم دليلًا على أن الملفات المطلوبة أصبحت جاهزة لتنفيذ Commit.</w:t>
       </w:r>
     </w:p>
     <w:p>
+      <w:pPr>
+        <w:jc w:val="center"/>
+      </w:pPr>
       <w:r>
         <w:drawing>
           <wp:inline xmlns:a="http://schemas.openxmlformats.org/drawingml/2006/main" xmlns:pic="http://schemas.openxmlformats.org/drawingml/2006/picture">
-            <wp:extent cx="5669280" cy="5439585"/>
+            <wp:extent cx="5806440" cy="5571188"/>
             <wp:docPr id="1" name="Picture 1"/>
             <wp:cNvGraphicFramePr>
               <a:graphicFrameLocks noChangeAspect="1"/>
@@ -427,7 +106,7 @@
                   <pic:spPr>
                     <a:xfrm>
                       <a:off x="0" y="0"/>
-                      <a:ext cx="5669280" cy="5439585"/>
+                      <a:ext cx="5806440" cy="5571188"/>
                     </a:xfrm>
                     <a:prstGeom prst="rect"/>
                   </pic:spPr>
@@ -439,23 +118,58 @@
       </w:r>
     </w:p>
     <w:p>
-      <w:pPr>
-        <w:pStyle w:val="Heading2"/>
-      </w:pPr>
       <w:r>
-        <w:t>2. 14_03_git_diff_staged_stat_terminal.png</w:t>
+        <w:br w:type="page"/>
       </w:r>
     </w:p>
     <w:p>
+      <w:pPr>
+        <w:pStyle w:val="Heading1"/>
+        <w:jc w:val="right"/>
+        <w:bidi w:val="1"/>
+      </w:pPr>
       <w:r>
-        <w:t>Shows the staged diff summary and file counts.</w:t>
+        <w:t>الصورة 2</w:t>
       </w:r>
     </w:p>
     <w:p>
+      <w:pPr>
+        <w:jc w:val="right"/>
+        <w:bidi w:val="1"/>
+      </w:pPr>
+      <w:r>
+        <w:rPr>
+          <w:b/>
+        </w:rPr>
+        <w:t xml:space="preserve">اسم الملف: </w:t>
+      </w:r>
+      <w:r>
+        <w:t>14_03_git_diff_staged_stat_terminal.png</w:t>
+      </w:r>
+    </w:p>
+    <w:p>
+      <w:pPr>
+        <w:jc w:val="right"/>
+        <w:bidi w:val="1"/>
+      </w:pPr>
+      <w:r>
+        <w:rPr>
+          <w:b/>
+        </w:rPr>
+        <w:t xml:space="preserve">الشرح: </w:t>
+      </w:r>
+      <w:r>
+        <w:t>توضح هذه الصورة استخدام الأمر git diff --staged --stat لعرض ملخص التغييرات الموجودة في منطقة التجهيز قبل تنفيذ عملية Commit.</w:t>
+      </w:r>
+    </w:p>
+    <w:p>
+      <w:pPr>
+        <w:jc w:val="center"/>
+      </w:pPr>
       <w:r>
         <w:drawing>
           <wp:inline xmlns:a="http://schemas.openxmlformats.org/drawingml/2006/main" xmlns:pic="http://schemas.openxmlformats.org/drawingml/2006/picture">
-            <wp:extent cx="5669280" cy="6115680"/>
+            <wp:extent cx="5806440" cy="6263640"/>
             <wp:docPr id="2" name="Picture 2"/>
             <wp:cNvGraphicFramePr>
               <a:graphicFrameLocks noChangeAspect="1"/>
@@ -476,7 +190,7 @@
                   <pic:spPr>
                     <a:xfrm>
                       <a:off x="0" y="0"/>
-                      <a:ext cx="5669280" cy="6115680"/>
+                      <a:ext cx="5806440" cy="6263640"/>
                     </a:xfrm>
                     <a:prstGeom prst="rect"/>
                   </pic:spPr>
@@ -488,23 +202,58 @@
       </w:r>
     </w:p>
     <w:p>
-      <w:pPr>
-        <w:pStyle w:val="Heading2"/>
-      </w:pPr>
       <w:r>
-        <w:t>3. 14_04_git_diff_staged_check_terminal.png</w:t>
+        <w:br w:type="page"/>
       </w:r>
     </w:p>
     <w:p>
+      <w:pPr>
+        <w:pStyle w:val="Heading1"/>
+        <w:jc w:val="right"/>
+        <w:bidi w:val="1"/>
+      </w:pPr>
       <w:r>
-        <w:t>Shows staged whitespace validation completing without errors.</w:t>
+        <w:t>الصورة 3</w:t>
       </w:r>
     </w:p>
     <w:p>
+      <w:pPr>
+        <w:jc w:val="right"/>
+        <w:bidi w:val="1"/>
+      </w:pPr>
+      <w:r>
+        <w:rPr>
+          <w:b/>
+        </w:rPr>
+        <w:t xml:space="preserve">اسم الملف: </w:t>
+      </w:r>
+      <w:r>
+        <w:t>14_04_git_diff_staged_check_terminal.png</w:t>
+      </w:r>
+    </w:p>
+    <w:p>
+      <w:pPr>
+        <w:jc w:val="right"/>
+        <w:bidi w:val="1"/>
+      </w:pPr>
+      <w:r>
+        <w:rPr>
+          <w:b/>
+        </w:rPr>
+        <w:t xml:space="preserve">الشرح: </w:t>
+      </w:r>
+      <w:r>
+        <w:t>توضح هذه الصورة تنفيذ الأمر git diff --staged --check للتحقق من عدم وجود أخطاء في المسافات أو مشكلات تنسيق داخل التغييرات المجهزة لتنفيذ Commit.</w:t>
+      </w:r>
+    </w:p>
+    <w:p>
+      <w:pPr>
+        <w:jc w:val="center"/>
+      </w:pPr>
       <w:r>
         <w:drawing>
           <wp:inline xmlns:a="http://schemas.openxmlformats.org/drawingml/2006/main" xmlns:pic="http://schemas.openxmlformats.org/drawingml/2006/picture">
-            <wp:extent cx="5669280" cy="1485401"/>
+            <wp:extent cx="5806440" cy="1521338"/>
             <wp:docPr id="3" name="Picture 3"/>
             <wp:cNvGraphicFramePr>
               <a:graphicFrameLocks noChangeAspect="1"/>
@@ -525,7 +274,7 @@
                   <pic:spPr>
                     <a:xfrm>
                       <a:off x="0" y="0"/>
-                      <a:ext cx="5669280" cy="1485401"/>
+                      <a:ext cx="5806440" cy="1521338"/>
                     </a:xfrm>
                     <a:prstGeom prst="rect"/>
                   </pic:spPr>
@@ -537,23 +286,58 @@
       </w:r>
     </w:p>
     <w:p>
-      <w:pPr>
-        <w:pStyle w:val="Heading2"/>
-      </w:pPr>
       <w:r>
-        <w:t>4. 14_05_pytest_full_suite_terminal.png</w:t>
+        <w:br w:type="page"/>
       </w:r>
     </w:p>
     <w:p>
+      <w:pPr>
+        <w:pStyle w:val="Heading1"/>
+        <w:jc w:val="right"/>
+        <w:bidi w:val="1"/>
+      </w:pPr>
       <w:r>
-        <w:t>Shows the complete pytest suite result.</w:t>
+        <w:t>الصورة 4</w:t>
       </w:r>
     </w:p>
     <w:p>
+      <w:pPr>
+        <w:jc w:val="right"/>
+        <w:bidi w:val="1"/>
+      </w:pPr>
+      <w:r>
+        <w:rPr>
+          <w:b/>
+        </w:rPr>
+        <w:t xml:space="preserve">اسم الملف: </w:t>
+      </w:r>
+      <w:r>
+        <w:t>14_05_pytest_full_suite_terminal.png</w:t>
+      </w:r>
+    </w:p>
+    <w:p>
+      <w:pPr>
+        <w:jc w:val="right"/>
+        <w:bidi w:val="1"/>
+      </w:pPr>
+      <w:r>
+        <w:rPr>
+          <w:b/>
+        </w:rPr>
+        <w:t xml:space="preserve">الشرح: </w:t>
+      </w:r>
+      <w:r>
+        <w:t>توضح هذه الصورة تشغيل مجموعة الاختبارات الكاملة باستخدام pytest والتحقق من نجاح اختبارات مشروع SmartClinic.</w:t>
+      </w:r>
+    </w:p>
+    <w:p>
+      <w:pPr>
+        <w:jc w:val="center"/>
+      </w:pPr>
       <w:r>
         <w:drawing>
           <wp:inline xmlns:a="http://schemas.openxmlformats.org/drawingml/2006/main" xmlns:pic="http://schemas.openxmlformats.org/drawingml/2006/picture">
-            <wp:extent cx="5669280" cy="1255853"/>
+            <wp:extent cx="5806440" cy="1286237"/>
             <wp:docPr id="4" name="Picture 4"/>
             <wp:cNvGraphicFramePr>
               <a:graphicFrameLocks noChangeAspect="1"/>
@@ -574,7 +358,7 @@
                   <pic:spPr>
                     <a:xfrm>
                       <a:off x="0" y="0"/>
-                      <a:ext cx="5669280" cy="1255853"/>
+                      <a:ext cx="5806440" cy="1286237"/>
                     </a:xfrm>
                     <a:prstGeom prst="rect"/>
                   </pic:spPr>
@@ -586,23 +370,58 @@
       </w:r>
     </w:p>
     <w:p>
-      <w:pPr>
-        <w:pStyle w:val="Heading2"/>
-      </w:pPr>
       <w:r>
-        <w:t>5. 14_06_git_diff_staged_terminal.png</w:t>
+        <w:br w:type="page"/>
       </w:r>
     </w:p>
     <w:p>
+      <w:pPr>
+        <w:pStyle w:val="Heading1"/>
+        <w:jc w:val="right"/>
+        <w:bidi w:val="1"/>
+      </w:pPr>
       <w:r>
-        <w:t>Shows the complete staged diff review.</w:t>
+        <w:t>الصورة 5</w:t>
       </w:r>
     </w:p>
     <w:p>
+      <w:pPr>
+        <w:jc w:val="right"/>
+        <w:bidi w:val="1"/>
+      </w:pPr>
+      <w:r>
+        <w:rPr>
+          <w:b/>
+        </w:rPr>
+        <w:t xml:space="preserve">اسم الملف: </w:t>
+      </w:r>
+      <w:r>
+        <w:t>14_06_git_diff_staged_terminal.png</w:t>
+      </w:r>
+    </w:p>
+    <w:p>
+      <w:pPr>
+        <w:jc w:val="right"/>
+        <w:bidi w:val="1"/>
+      </w:pPr>
+      <w:r>
+        <w:rPr>
+          <w:b/>
+        </w:rPr>
+        <w:t xml:space="preserve">الشرح: </w:t>
+      </w:r>
+      <w:r>
+        <w:t>توضح هذه الصورة مراجعة التغييرات الموجودة في منطقة التجهيز قبل تسجيلها في Git، وهي خطوة مهمة للتحقق من العمل قبل إنشاء Commit.</w:t>
+      </w:r>
+    </w:p>
+    <w:p>
+      <w:pPr>
+        <w:jc w:val="center"/>
+      </w:pPr>
       <w:r>
         <w:drawing>
           <wp:inline xmlns:a="http://schemas.openxmlformats.org/drawingml/2006/main" xmlns:pic="http://schemas.openxmlformats.org/drawingml/2006/picture">
-            <wp:extent cx="5669280" cy="6045726"/>
+            <wp:extent cx="5806440" cy="6191994"/>
             <wp:docPr id="5" name="Picture 5"/>
             <wp:cNvGraphicFramePr>
               <a:graphicFrameLocks noChangeAspect="1"/>
@@ -623,7 +442,7 @@
                   <pic:spPr>
                     <a:xfrm>
                       <a:off x="0" y="0"/>
-                      <a:ext cx="5669280" cy="6045726"/>
+                      <a:ext cx="5806440" cy="6191994"/>
                     </a:xfrm>
                     <a:prstGeom prst="rect"/>
                   </pic:spPr>
@@ -635,23 +454,58 @@
       </w:r>
     </w:p>
     <w:p>
-      <w:pPr>
-        <w:pStyle w:val="Heading2"/>
-      </w:pPr>
       <w:r>
-        <w:t>6. 14_06_initial_commit_terminal.png</w:t>
+        <w:br w:type="page"/>
       </w:r>
     </w:p>
     <w:p>
+      <w:pPr>
+        <w:pStyle w:val="Heading1"/>
+        <w:jc w:val="right"/>
+        <w:bidi w:val="1"/>
+      </w:pPr>
       <w:r>
-        <w:t>Shows creation of the initial SmartClinic baseline commit.</w:t>
+        <w:t>الصورة 6</w:t>
       </w:r>
     </w:p>
     <w:p>
+      <w:pPr>
+        <w:jc w:val="right"/>
+        <w:bidi w:val="1"/>
+      </w:pPr>
+      <w:r>
+        <w:rPr>
+          <w:b/>
+        </w:rPr>
+        <w:t xml:space="preserve">اسم الملف: </w:t>
+      </w:r>
+      <w:r>
+        <w:t>14_06_initial_commit_terminal.png</w:t>
+      </w:r>
+    </w:p>
+    <w:p>
+      <w:pPr>
+        <w:jc w:val="right"/>
+        <w:bidi w:val="1"/>
+      </w:pPr>
+      <w:r>
+        <w:rPr>
+          <w:b/>
+        </w:rPr>
+        <w:t xml:space="preserve">الشرح: </w:t>
+      </w:r>
+      <w:r>
+        <w:t>توضح هذه الصورة تنفيذ أول Commit أساسي للمشروع وتسجيل النسخة الأولية من مشروع SmartClinic في Git.</w:t>
+      </w:r>
+    </w:p>
+    <w:p>
+      <w:pPr>
+        <w:jc w:val="center"/>
+      </w:pPr>
       <w:r>
         <w:drawing>
           <wp:inline xmlns:a="http://schemas.openxmlformats.org/drawingml/2006/main" xmlns:pic="http://schemas.openxmlformats.org/drawingml/2006/picture">
-            <wp:extent cx="5669280" cy="4255641"/>
+            <wp:extent cx="5806440" cy="4358600"/>
             <wp:docPr id="6" name="Picture 6"/>
             <wp:cNvGraphicFramePr>
               <a:graphicFrameLocks noChangeAspect="1"/>
@@ -672,7 +526,7 @@
                   <pic:spPr>
                     <a:xfrm>
                       <a:off x="0" y="0"/>
-                      <a:ext cx="5669280" cy="4255641"/>
+                      <a:ext cx="5806440" cy="4358600"/>
                     </a:xfrm>
                     <a:prstGeom prst="rect"/>
                   </pic:spPr>
@@ -684,23 +538,58 @@
       </w:r>
     </w:p>
     <w:p>
-      <w:pPr>
-        <w:pStyle w:val="Heading2"/>
-      </w:pPr>
       <w:r>
-        <w:t>7. 14_07_git_log_initial_commit_terminal.png</w:t>
+        <w:br w:type="page"/>
       </w:r>
     </w:p>
     <w:p>
+      <w:pPr>
+        <w:pStyle w:val="Heading1"/>
+        <w:jc w:val="right"/>
+        <w:bidi w:val="1"/>
+      </w:pPr>
       <w:r>
-        <w:t>Shows the initial commit in Git history.</w:t>
+        <w:t>الصورة 7</w:t>
       </w:r>
     </w:p>
     <w:p>
+      <w:pPr>
+        <w:jc w:val="right"/>
+        <w:bidi w:val="1"/>
+      </w:pPr>
+      <w:r>
+        <w:rPr>
+          <w:b/>
+        </w:rPr>
+        <w:t xml:space="preserve">اسم الملف: </w:t>
+      </w:r>
+      <w:r>
+        <w:t>14_07_git_log_initial_commit_terminal.png</w:t>
+      </w:r>
+    </w:p>
+    <w:p>
+      <w:pPr>
+        <w:jc w:val="right"/>
+        <w:bidi w:val="1"/>
+      </w:pPr>
+      <w:r>
+        <w:rPr>
+          <w:b/>
+        </w:rPr>
+        <w:t xml:space="preserve">الشرح: </w:t>
+      </w:r>
+      <w:r>
+        <w:t>توضح هذه الصورة استخدام سجل Git لعرض Commit الأساسي للمشروع والتحقق من وجوده في تاريخ المستودع.</w:t>
+      </w:r>
+    </w:p>
+    <w:p>
+      <w:pPr>
+        <w:jc w:val="center"/>
+      </w:pPr>
       <w:r>
         <w:drawing>
           <wp:inline xmlns:a="http://schemas.openxmlformats.org/drawingml/2006/main" xmlns:pic="http://schemas.openxmlformats.org/drawingml/2006/picture">
-            <wp:extent cx="5669280" cy="629046"/>
+            <wp:extent cx="5806440" cy="644265"/>
             <wp:docPr id="7" name="Picture 7"/>
             <wp:cNvGraphicFramePr>
               <a:graphicFrameLocks noChangeAspect="1"/>
@@ -721,7 +610,7 @@
                   <pic:spPr>
                     <a:xfrm>
                       <a:off x="0" y="0"/>
-                      <a:ext cx="5669280" cy="629046"/>
+                      <a:ext cx="5806440" cy="644265"/>
                     </a:xfrm>
                     <a:prstGeom prst="rect"/>
                   </pic:spPr>
@@ -733,23 +622,58 @@
       </w:r>
     </w:p>
     <w:p>
-      <w:pPr>
-        <w:pStyle w:val="Heading2"/>
-      </w:pPr>
       <w:r>
-        <w:t>8. 14_08_git_status_clean_terminal.png</w:t>
+        <w:br w:type="page"/>
       </w:r>
     </w:p>
     <w:p>
+      <w:pPr>
+        <w:pStyle w:val="Heading1"/>
+        <w:jc w:val="right"/>
+        <w:bidi w:val="1"/>
+      </w:pPr>
       <w:r>
-        <w:t>Shows a clean working tree after the initial commit.</w:t>
+        <w:t>الصورة 8</w:t>
       </w:r>
     </w:p>
     <w:p>
+      <w:pPr>
+        <w:jc w:val="right"/>
+        <w:bidi w:val="1"/>
+      </w:pPr>
+      <w:r>
+        <w:rPr>
+          <w:b/>
+        </w:rPr>
+        <w:t xml:space="preserve">اسم الملف: </w:t>
+      </w:r>
+      <w:r>
+        <w:t>14_08_git_status_clean_terminal.png</w:t>
+      </w:r>
+    </w:p>
+    <w:p>
+      <w:pPr>
+        <w:jc w:val="right"/>
+        <w:bidi w:val="1"/>
+      </w:pPr>
+      <w:r>
+        <w:rPr>
+          <w:b/>
+        </w:rPr>
+        <w:t xml:space="preserve">الشرح: </w:t>
+      </w:r>
+      <w:r>
+        <w:t>توضح هذه الصورة أن حالة مستودع Git أصبحت نظيفة بعد حفظ التغييرات، ولا توجد تغييرات غير مسجلة تحتاج إلى Commit.</w:t>
+      </w:r>
+    </w:p>
+    <w:p>
+      <w:pPr>
+        <w:jc w:val="center"/>
+      </w:pPr>
       <w:r>
         <w:drawing>
           <wp:inline xmlns:a="http://schemas.openxmlformats.org/drawingml/2006/main" xmlns:pic="http://schemas.openxmlformats.org/drawingml/2006/picture">
-            <wp:extent cx="5669280" cy="958188"/>
+            <wp:extent cx="5806440" cy="981370"/>
             <wp:docPr id="8" name="Picture 8"/>
             <wp:cNvGraphicFramePr>
               <a:graphicFrameLocks noChangeAspect="1"/>
@@ -770,7 +694,7 @@
                   <pic:spPr>
                     <a:xfrm>
                       <a:off x="0" y="0"/>
-                      <a:ext cx="5669280" cy="958188"/>
+                      <a:ext cx="5806440" cy="981370"/>
                     </a:xfrm>
                     <a:prstGeom prst="rect"/>
                   </pic:spPr>
@@ -782,23 +706,58 @@
       </w:r>
     </w:p>
     <w:p>
-      <w:pPr>
-        <w:pStyle w:val="Heading2"/>
-      </w:pPr>
       <w:r>
-        <w:t>9. 14_09_git_log_terminal.png</w:t>
+        <w:br w:type="page"/>
       </w:r>
     </w:p>
     <w:p>
+      <w:pPr>
+        <w:pStyle w:val="Heading1"/>
+        <w:jc w:val="right"/>
+        <w:bidi w:val="1"/>
+      </w:pPr>
       <w:r>
-        <w:t>Shows Git log verification for the project history.</w:t>
+        <w:t>الصورة 9</w:t>
       </w:r>
     </w:p>
     <w:p>
+      <w:pPr>
+        <w:jc w:val="right"/>
+        <w:bidi w:val="1"/>
+      </w:pPr>
+      <w:r>
+        <w:rPr>
+          <w:b/>
+        </w:rPr>
+        <w:t xml:space="preserve">اسم الملف: </w:t>
+      </w:r>
+      <w:r>
+        <w:t>14_09_git_log_terminal.png</w:t>
+      </w:r>
+    </w:p>
+    <w:p>
+      <w:pPr>
+        <w:jc w:val="right"/>
+        <w:bidi w:val="1"/>
+      </w:pPr>
+      <w:r>
+        <w:rPr>
+          <w:b/>
+        </w:rPr>
+        <w:t xml:space="preserve">الشرح: </w:t>
+      </w:r>
+      <w:r>
+        <w:t>توضح هذه الصورة سجل Git الخاص بالمشروع، وتستخدم دليلًا على وجود تاريخ منظم لعمليات Commit.</w:t>
+      </w:r>
+    </w:p>
+    <w:p>
+      <w:pPr>
+        <w:jc w:val="center"/>
+      </w:pPr>
       <w:r>
         <w:drawing>
           <wp:inline xmlns:a="http://schemas.openxmlformats.org/drawingml/2006/main" xmlns:pic="http://schemas.openxmlformats.org/drawingml/2006/picture">
-            <wp:extent cx="5669280" cy="772702"/>
+            <wp:extent cx="5806440" cy="791396"/>
             <wp:docPr id="9" name="Picture 9"/>
             <wp:cNvGraphicFramePr>
               <a:graphicFrameLocks noChangeAspect="1"/>
@@ -819,7 +778,7 @@
                   <pic:spPr>
                     <a:xfrm>
                       <a:off x="0" y="0"/>
-                      <a:ext cx="5669280" cy="772702"/>
+                      <a:ext cx="5806440" cy="791396"/>
                     </a:xfrm>
                     <a:prstGeom prst="rect"/>
                   </pic:spPr>
@@ -831,23 +790,58 @@
       </w:r>
     </w:p>
     <w:p>
-      <w:pPr>
-        <w:pStyle w:val="Heading2"/>
-      </w:pPr>
       <w:r>
-        <w:t>10. 15_04_git_status_clean_terminal.png</w:t>
+        <w:br w:type="page"/>
       </w:r>
     </w:p>
     <w:p>
+      <w:pPr>
+        <w:pStyle w:val="Heading1"/>
+        <w:jc w:val="right"/>
+        <w:bidi w:val="1"/>
+      </w:pPr>
       <w:r>
-        <w:t>Shows the clean working tree after screenshot publication.</w:t>
+        <w:t>الصورة 10</w:t>
       </w:r>
     </w:p>
     <w:p>
+      <w:pPr>
+        <w:jc w:val="right"/>
+        <w:bidi w:val="1"/>
+      </w:pPr>
+      <w:r>
+        <w:rPr>
+          <w:b/>
+        </w:rPr>
+        <w:t xml:space="preserve">اسم الملف: </w:t>
+      </w:r>
+      <w:r>
+        <w:t>15_04_git_status_clean_terminal.png</w:t>
+      </w:r>
+    </w:p>
+    <w:p>
+      <w:pPr>
+        <w:jc w:val="right"/>
+        <w:bidi w:val="1"/>
+      </w:pPr>
+      <w:r>
+        <w:rPr>
+          <w:b/>
+        </w:rPr>
+        <w:t xml:space="preserve">الشرح: </w:t>
+      </w:r>
+      <w:r>
+        <w:t>توضح هذه الصورة الحالة النهائية لمستودع Git، حيث لا توجد تغييرات غير محفوظة، ويظهر أن المشروع في حالة نظيفة وجاهز للتسليم.</w:t>
+      </w:r>
+    </w:p>
+    <w:p>
+      <w:pPr>
+        <w:jc w:val="center"/>
+      </w:pPr>
       <w:r>
         <w:drawing>
           <wp:inline xmlns:a="http://schemas.openxmlformats.org/drawingml/2006/main" xmlns:pic="http://schemas.openxmlformats.org/drawingml/2006/picture">
-            <wp:extent cx="5669280" cy="1047028"/>
+            <wp:extent cx="5806440" cy="1072359"/>
             <wp:docPr id="10" name="Picture 10"/>
             <wp:cNvGraphicFramePr>
               <a:graphicFrameLocks noChangeAspect="1"/>
@@ -868,7 +862,7 @@
                   <pic:spPr>
                     <a:xfrm>
                       <a:off x="0" y="0"/>
-                      <a:ext cx="5669280" cy="1047028"/>
+                      <a:ext cx="5806440" cy="1072359"/>
                     </a:xfrm>
                     <a:prstGeom prst="rect"/>
                   </pic:spPr>
@@ -879,9 +873,553 @@
         </w:drawing>
       </w:r>
     </w:p>
+    <w:p>
+      <w:r>
+        <w:br w:type="page"/>
+      </w:r>
+    </w:p>
+    <w:p>
+      <w:pPr>
+        <w:pStyle w:val="Heading1"/>
+        <w:jc w:val="right"/>
+        <w:bidi w:val="1"/>
+      </w:pPr>
+      <w:r>
+        <w:t>فهرس الأدلة</w:t>
+      </w:r>
+    </w:p>
+    <w:tbl>
+      <w:tblPr>
+        <w:tblStyle w:val="TableGrid"/>
+        <w:tblW w:type="auto" w:w="0"/>
+        <w:tblLook w:firstColumn="1" w:firstRow="1" w:lastColumn="0" w:lastRow="0" w:noHBand="0" w:noVBand="1" w:val="04A0"/>
+      </w:tblPr>
+      <w:tblGrid>
+        <w:gridCol w:w="3456"/>
+        <w:gridCol w:w="3456"/>
+        <w:gridCol w:w="3456"/>
+      </w:tblGrid>
+      <w:tr>
+        <w:tc>
+          <w:tcPr>
+            <w:tcW w:type="dxa" w:w="3456"/>
+            <w:bidiVisual w:val="1"/>
+          </w:tcPr>
+          <w:p>
+            <w:pPr>
+              <w:jc w:val="right"/>
+              <w:bidi w:val="1"/>
+            </w:pPr>
+            <w:r>
+              <w:t>الرقم</w:t>
+            </w:r>
+          </w:p>
+        </w:tc>
+        <w:tc>
+          <w:tcPr>
+            <w:tcW w:type="dxa" w:w="3456"/>
+            <w:bidiVisual w:val="1"/>
+          </w:tcPr>
+          <w:p>
+            <w:pPr>
+              <w:jc w:val="right"/>
+              <w:bidi w:val="1"/>
+            </w:pPr>
+            <w:r>
+              <w:t>اسم الملف</w:t>
+            </w:r>
+          </w:p>
+        </w:tc>
+        <w:tc>
+          <w:tcPr>
+            <w:tcW w:type="dxa" w:w="3456"/>
+            <w:bidiVisual w:val="1"/>
+          </w:tcPr>
+          <w:p>
+            <w:pPr>
+              <w:jc w:val="right"/>
+              <w:bidi w:val="1"/>
+            </w:pPr>
+            <w:r>
+              <w:t>وصف الدليل</w:t>
+            </w:r>
+          </w:p>
+        </w:tc>
+      </w:tr>
+      <w:tr>
+        <w:tc>
+          <w:tcPr>
+            <w:tcW w:type="dxa" w:w="3456"/>
+            <w:bidiVisual w:val="1"/>
+          </w:tcPr>
+          <w:p>
+            <w:pPr>
+              <w:jc w:val="right"/>
+              <w:bidi w:val="1"/>
+            </w:pPr>
+            <w:r>
+              <w:t>1</w:t>
+            </w:r>
+          </w:p>
+        </w:tc>
+        <w:tc>
+          <w:tcPr>
+            <w:tcW w:type="dxa" w:w="3456"/>
+            <w:bidiVisual w:val="1"/>
+          </w:tcPr>
+          <w:p>
+            <w:pPr>
+              <w:jc w:val="right"/>
+              <w:bidi w:val="1"/>
+            </w:pPr>
+            <w:r>
+              <w:t>14_01_git_status_staged.png</w:t>
+            </w:r>
+          </w:p>
+        </w:tc>
+        <w:tc>
+          <w:tcPr>
+            <w:tcW w:type="dxa" w:w="3456"/>
+            <w:bidiVisual w:val="1"/>
+          </w:tcPr>
+          <w:p>
+            <w:pPr>
+              <w:jc w:val="right"/>
+              <w:bidi w:val="1"/>
+            </w:pPr>
+            <w:r>
+              <w:t>توضح هذه الصورة حالة مستودع Git بعد إضافة الملفات إلى منطقة التجهيز (Staging Area)، وتستخدم دليلًا على أن الملفات المطلوبة أصبحت جاهزة لتنفيذ Commit.</w:t>
+            </w:r>
+          </w:p>
+        </w:tc>
+      </w:tr>
+      <w:tr>
+        <w:tc>
+          <w:tcPr>
+            <w:tcW w:type="dxa" w:w="3456"/>
+            <w:bidiVisual w:val="1"/>
+          </w:tcPr>
+          <w:p>
+            <w:pPr>
+              <w:jc w:val="right"/>
+              <w:bidi w:val="1"/>
+            </w:pPr>
+            <w:r>
+              <w:t>2</w:t>
+            </w:r>
+          </w:p>
+        </w:tc>
+        <w:tc>
+          <w:tcPr>
+            <w:tcW w:type="dxa" w:w="3456"/>
+            <w:bidiVisual w:val="1"/>
+          </w:tcPr>
+          <w:p>
+            <w:pPr>
+              <w:jc w:val="right"/>
+              <w:bidi w:val="1"/>
+            </w:pPr>
+            <w:r>
+              <w:t>14_03_git_diff_staged_stat_terminal.png</w:t>
+            </w:r>
+          </w:p>
+        </w:tc>
+        <w:tc>
+          <w:tcPr>
+            <w:tcW w:type="dxa" w:w="3456"/>
+            <w:bidiVisual w:val="1"/>
+          </w:tcPr>
+          <w:p>
+            <w:pPr>
+              <w:jc w:val="right"/>
+              <w:bidi w:val="1"/>
+            </w:pPr>
+            <w:r>
+              <w:t>توضح هذه الصورة استخدام الأمر git diff --staged --stat لعرض ملخص التغييرات الموجودة في منطقة التجهيز قبل تنفيذ عملية Commit.</w:t>
+            </w:r>
+          </w:p>
+        </w:tc>
+      </w:tr>
+      <w:tr>
+        <w:tc>
+          <w:tcPr>
+            <w:tcW w:type="dxa" w:w="3456"/>
+            <w:bidiVisual w:val="1"/>
+          </w:tcPr>
+          <w:p>
+            <w:pPr>
+              <w:jc w:val="right"/>
+              <w:bidi w:val="1"/>
+            </w:pPr>
+            <w:r>
+              <w:t>3</w:t>
+            </w:r>
+          </w:p>
+        </w:tc>
+        <w:tc>
+          <w:tcPr>
+            <w:tcW w:type="dxa" w:w="3456"/>
+            <w:bidiVisual w:val="1"/>
+          </w:tcPr>
+          <w:p>
+            <w:pPr>
+              <w:jc w:val="right"/>
+              <w:bidi w:val="1"/>
+            </w:pPr>
+            <w:r>
+              <w:t>14_04_git_diff_staged_check_terminal.png</w:t>
+            </w:r>
+          </w:p>
+        </w:tc>
+        <w:tc>
+          <w:tcPr>
+            <w:tcW w:type="dxa" w:w="3456"/>
+            <w:bidiVisual w:val="1"/>
+          </w:tcPr>
+          <w:p>
+            <w:pPr>
+              <w:jc w:val="right"/>
+              <w:bidi w:val="1"/>
+            </w:pPr>
+            <w:r>
+              <w:t>توضح هذه الصورة تنفيذ الأمر git diff --staged --check للتحقق من عدم وجود أخطاء في المسافات أو مشكلات تنسيق داخل التغييرات المجهزة لتنفيذ Commit.</w:t>
+            </w:r>
+          </w:p>
+        </w:tc>
+      </w:tr>
+      <w:tr>
+        <w:tc>
+          <w:tcPr>
+            <w:tcW w:type="dxa" w:w="3456"/>
+            <w:bidiVisual w:val="1"/>
+          </w:tcPr>
+          <w:p>
+            <w:pPr>
+              <w:jc w:val="right"/>
+              <w:bidi w:val="1"/>
+            </w:pPr>
+            <w:r>
+              <w:t>4</w:t>
+            </w:r>
+          </w:p>
+        </w:tc>
+        <w:tc>
+          <w:tcPr>
+            <w:tcW w:type="dxa" w:w="3456"/>
+            <w:bidiVisual w:val="1"/>
+          </w:tcPr>
+          <w:p>
+            <w:pPr>
+              <w:jc w:val="right"/>
+              <w:bidi w:val="1"/>
+            </w:pPr>
+            <w:r>
+              <w:t>14_05_pytest_full_suite_terminal.png</w:t>
+            </w:r>
+          </w:p>
+        </w:tc>
+        <w:tc>
+          <w:tcPr>
+            <w:tcW w:type="dxa" w:w="3456"/>
+            <w:bidiVisual w:val="1"/>
+          </w:tcPr>
+          <w:p>
+            <w:pPr>
+              <w:jc w:val="right"/>
+              <w:bidi w:val="1"/>
+            </w:pPr>
+            <w:r>
+              <w:t>توضح هذه الصورة تشغيل مجموعة الاختبارات الكاملة باستخدام pytest والتحقق من نجاح اختبارات مشروع SmartClinic.</w:t>
+            </w:r>
+          </w:p>
+        </w:tc>
+      </w:tr>
+      <w:tr>
+        <w:tc>
+          <w:tcPr>
+            <w:tcW w:type="dxa" w:w="3456"/>
+            <w:bidiVisual w:val="1"/>
+          </w:tcPr>
+          <w:p>
+            <w:pPr>
+              <w:jc w:val="right"/>
+              <w:bidi w:val="1"/>
+            </w:pPr>
+            <w:r>
+              <w:t>5</w:t>
+            </w:r>
+          </w:p>
+        </w:tc>
+        <w:tc>
+          <w:tcPr>
+            <w:tcW w:type="dxa" w:w="3456"/>
+            <w:bidiVisual w:val="1"/>
+          </w:tcPr>
+          <w:p>
+            <w:pPr>
+              <w:jc w:val="right"/>
+              <w:bidi w:val="1"/>
+            </w:pPr>
+            <w:r>
+              <w:t>14_06_git_diff_staged_terminal.png</w:t>
+            </w:r>
+          </w:p>
+        </w:tc>
+        <w:tc>
+          <w:tcPr>
+            <w:tcW w:type="dxa" w:w="3456"/>
+            <w:bidiVisual w:val="1"/>
+          </w:tcPr>
+          <w:p>
+            <w:pPr>
+              <w:jc w:val="right"/>
+              <w:bidi w:val="1"/>
+            </w:pPr>
+            <w:r>
+              <w:t>توضح هذه الصورة مراجعة التغييرات الموجودة في منطقة التجهيز قبل تسجيلها في Git، وهي خطوة مهمة للتحقق من العمل قبل إنشاء Commit.</w:t>
+            </w:r>
+          </w:p>
+        </w:tc>
+      </w:tr>
+      <w:tr>
+        <w:tc>
+          <w:tcPr>
+            <w:tcW w:type="dxa" w:w="3456"/>
+            <w:bidiVisual w:val="1"/>
+          </w:tcPr>
+          <w:p>
+            <w:pPr>
+              <w:jc w:val="right"/>
+              <w:bidi w:val="1"/>
+            </w:pPr>
+            <w:r>
+              <w:t>6</w:t>
+            </w:r>
+          </w:p>
+        </w:tc>
+        <w:tc>
+          <w:tcPr>
+            <w:tcW w:type="dxa" w:w="3456"/>
+            <w:bidiVisual w:val="1"/>
+          </w:tcPr>
+          <w:p>
+            <w:pPr>
+              <w:jc w:val="right"/>
+              <w:bidi w:val="1"/>
+            </w:pPr>
+            <w:r>
+              <w:t>14_06_initial_commit_terminal.png</w:t>
+            </w:r>
+          </w:p>
+        </w:tc>
+        <w:tc>
+          <w:tcPr>
+            <w:tcW w:type="dxa" w:w="3456"/>
+            <w:bidiVisual w:val="1"/>
+          </w:tcPr>
+          <w:p>
+            <w:pPr>
+              <w:jc w:val="right"/>
+              <w:bidi w:val="1"/>
+            </w:pPr>
+            <w:r>
+              <w:t>توضح هذه الصورة تنفيذ أول Commit أساسي للمشروع وتسجيل النسخة الأولية من مشروع SmartClinic في Git.</w:t>
+            </w:r>
+          </w:p>
+        </w:tc>
+      </w:tr>
+      <w:tr>
+        <w:tc>
+          <w:tcPr>
+            <w:tcW w:type="dxa" w:w="3456"/>
+            <w:bidiVisual w:val="1"/>
+          </w:tcPr>
+          <w:p>
+            <w:pPr>
+              <w:jc w:val="right"/>
+              <w:bidi w:val="1"/>
+            </w:pPr>
+            <w:r>
+              <w:t>7</w:t>
+            </w:r>
+          </w:p>
+        </w:tc>
+        <w:tc>
+          <w:tcPr>
+            <w:tcW w:type="dxa" w:w="3456"/>
+            <w:bidiVisual w:val="1"/>
+          </w:tcPr>
+          <w:p>
+            <w:pPr>
+              <w:jc w:val="right"/>
+              <w:bidi w:val="1"/>
+            </w:pPr>
+            <w:r>
+              <w:t>14_07_git_log_initial_commit_terminal.png</w:t>
+            </w:r>
+          </w:p>
+        </w:tc>
+        <w:tc>
+          <w:tcPr>
+            <w:tcW w:type="dxa" w:w="3456"/>
+            <w:bidiVisual w:val="1"/>
+          </w:tcPr>
+          <w:p>
+            <w:pPr>
+              <w:jc w:val="right"/>
+              <w:bidi w:val="1"/>
+            </w:pPr>
+            <w:r>
+              <w:t>توضح هذه الصورة استخدام سجل Git لعرض Commit الأساسي للمشروع والتحقق من وجوده في تاريخ المستودع.</w:t>
+            </w:r>
+          </w:p>
+        </w:tc>
+      </w:tr>
+      <w:tr>
+        <w:tc>
+          <w:tcPr>
+            <w:tcW w:type="dxa" w:w="3456"/>
+            <w:bidiVisual w:val="1"/>
+          </w:tcPr>
+          <w:p>
+            <w:pPr>
+              <w:jc w:val="right"/>
+              <w:bidi w:val="1"/>
+            </w:pPr>
+            <w:r>
+              <w:t>8</w:t>
+            </w:r>
+          </w:p>
+        </w:tc>
+        <w:tc>
+          <w:tcPr>
+            <w:tcW w:type="dxa" w:w="3456"/>
+            <w:bidiVisual w:val="1"/>
+          </w:tcPr>
+          <w:p>
+            <w:pPr>
+              <w:jc w:val="right"/>
+              <w:bidi w:val="1"/>
+            </w:pPr>
+            <w:r>
+              <w:t>14_08_git_status_clean_terminal.png</w:t>
+            </w:r>
+          </w:p>
+        </w:tc>
+        <w:tc>
+          <w:tcPr>
+            <w:tcW w:type="dxa" w:w="3456"/>
+            <w:bidiVisual w:val="1"/>
+          </w:tcPr>
+          <w:p>
+            <w:pPr>
+              <w:jc w:val="right"/>
+              <w:bidi w:val="1"/>
+            </w:pPr>
+            <w:r>
+              <w:t>توضح هذه الصورة أن حالة مستودع Git أصبحت نظيفة بعد حفظ التغييرات، ولا توجد تغييرات غير مسجلة تحتاج إلى Commit.</w:t>
+            </w:r>
+          </w:p>
+        </w:tc>
+      </w:tr>
+      <w:tr>
+        <w:tc>
+          <w:tcPr>
+            <w:tcW w:type="dxa" w:w="3456"/>
+            <w:bidiVisual w:val="1"/>
+          </w:tcPr>
+          <w:p>
+            <w:pPr>
+              <w:jc w:val="right"/>
+              <w:bidi w:val="1"/>
+            </w:pPr>
+            <w:r>
+              <w:t>9</w:t>
+            </w:r>
+          </w:p>
+        </w:tc>
+        <w:tc>
+          <w:tcPr>
+            <w:tcW w:type="dxa" w:w="3456"/>
+            <w:bidiVisual w:val="1"/>
+          </w:tcPr>
+          <w:p>
+            <w:pPr>
+              <w:jc w:val="right"/>
+              <w:bidi w:val="1"/>
+            </w:pPr>
+            <w:r>
+              <w:t>14_09_git_log_terminal.png</w:t>
+            </w:r>
+          </w:p>
+        </w:tc>
+        <w:tc>
+          <w:tcPr>
+            <w:tcW w:type="dxa" w:w="3456"/>
+            <w:bidiVisual w:val="1"/>
+          </w:tcPr>
+          <w:p>
+            <w:pPr>
+              <w:jc w:val="right"/>
+              <w:bidi w:val="1"/>
+            </w:pPr>
+            <w:r>
+              <w:t>توضح هذه الصورة سجل Git الخاص بالمشروع، وتستخدم دليلًا على وجود تاريخ منظم لعمليات Commit.</w:t>
+            </w:r>
+          </w:p>
+        </w:tc>
+      </w:tr>
+      <w:tr>
+        <w:tc>
+          <w:tcPr>
+            <w:tcW w:type="dxa" w:w="3456"/>
+            <w:bidiVisual w:val="1"/>
+          </w:tcPr>
+          <w:p>
+            <w:pPr>
+              <w:jc w:val="right"/>
+              <w:bidi w:val="1"/>
+            </w:pPr>
+            <w:r>
+              <w:t>10</w:t>
+            </w:r>
+          </w:p>
+        </w:tc>
+        <w:tc>
+          <w:tcPr>
+            <w:tcW w:type="dxa" w:w="3456"/>
+            <w:bidiVisual w:val="1"/>
+          </w:tcPr>
+          <w:p>
+            <w:pPr>
+              <w:jc w:val="right"/>
+              <w:bidi w:val="1"/>
+            </w:pPr>
+            <w:r>
+              <w:t>15_04_git_status_clean_terminal.png</w:t>
+            </w:r>
+          </w:p>
+        </w:tc>
+        <w:tc>
+          <w:tcPr>
+            <w:tcW w:type="dxa" w:w="3456"/>
+            <w:bidiVisual w:val="1"/>
+          </w:tcPr>
+          <w:p>
+            <w:pPr>
+              <w:jc w:val="right"/>
+              <w:bidi w:val="1"/>
+            </w:pPr>
+            <w:r>
+              <w:t>توضح هذه الصورة الحالة النهائية لمستودع Git، حيث لا توجد تغييرات غير محفوظة، ويظهر أن المشروع في حالة نظيفة وجاهز للتسليم.</w:t>
+            </w:r>
+          </w:p>
+        </w:tc>
+      </w:tr>
+    </w:tbl>
     <w:sectPr>
       <w:pgSz w:w="12240" w:h="15840"/>
-      <w:pgMar w:top="1440" w:right="1800" w:bottom="1440" w:left="1800" w:header="720" w:footer="720" w:gutter="0"/>
+      <w:pgMar w:top="1440" w:right="936" w:bottom="1440" w:left="936" w:header="720" w:footer="720" w:gutter="0"/>
       <w:cols w:space="720"/>
       <w:docGrid w:linePitch="360"/>
     </w:sectPr>
@@ -1252,6 +1790,10 @@
     <w:name w:val="Normal"/>
     <w:qFormat/>
     <w:rsid w:val="00FC693F"/>
+    <w:rPr>
+      <w:rFonts w:ascii="Arial" w:hAnsi="Arial" w:eastAsia="Arial"/>
+      <w:sz w:val="22"/>
+    </w:rPr>
   </w:style>
   <w:style w:type="paragraph" w:styleId="Header">
     <w:name w:val="header"/>

</xml_diff>